<commit_message>
docs(ciszupy): sync documentation rewrites across txt/md/docx
</commit_message>
<xml_diff>
--- a/projects/ciszupy/docs/docx/ABOUT.docx
+++ b/projects/ciszupy/docs/docx/ABOUT.docx
@@ -7,7 +7,7 @@
         <w:pStyle w:val="FirstParagraph"/>
       </w:pPr>
       <w:r>
-        <w:t xml:space="preserve">CISZUBOT - DOCUMENTACIÓN OFICIAL</w:t>
+        <w:t xml:space="preserve">CISZUPY - DOCUMENTACIÓN OFICIAL</w:t>
       </w:r>
       <w:r>
         <w:t xml:space="preserve"> </w:t>
@@ -19,19 +19,19 @@
         <w:t xml:space="preserve"> </w:t>
       </w:r>
       <w:r>
-        <w:t xml:space="preserve">Versión: 2.5.5</w:t>
+        <w:t xml:space="preserve">Versión: 0.1.0</w:t>
       </w:r>
       <w:r>
         <w:t xml:space="preserve"> </w:t>
       </w:r>
       <w:r>
-        <w:t xml:space="preserve">Actualización: 2026-07-28</w:t>
+        <w:t xml:space="preserve">Actualización: 2026-09-17</w:t>
       </w:r>
       <w:r>
         <w:t xml:space="preserve"> </w:t>
       </w:r>
       <w:r>
-        <w:t xml:space="preserve">Identificador: ABOUT_V2.5.5_2026_07_28_ciszubot</w:t>
+        <w:t xml:space="preserve">Identificador: ABOUT_V0.1.0_2026_09_17_ciszupy</w:t>
       </w:r>
     </w:p>
     <w:p>
@@ -46,7 +46,7 @@
         <w:pStyle w:val="FirstParagraph"/>
       </w:pPr>
       <w:r>
-        <w:t xml:space="preserve">SOBRE CISZUBOT / ABOUT CISZUBOT</w:t>
+        <w:t xml:space="preserve">SOBRE CISZUPY / ABOUT CISZUPY</w:t>
       </w:r>
     </w:p>
     <w:p>
@@ -60,13 +60,19 @@
         <w:t xml:space="preserve"> </w:t>
       </w:r>
       <w:r>
-        <w:t xml:space="preserve">Ciszubot es un bot de Discord en español con 12 comandos de información,</w:t>
+        <w:t xml:space="preserve">Ciszupy es una librería y CLI de Python híbrida que invierte el clásico</w:t>
       </w:r>
       <w:r>
         <w:t xml:space="preserve"> </w:t>
       </w:r>
       <w:r>
-        <w:t xml:space="preserve">utilidad, diversión y sociales. Moderno, rápido y fácil de usar.</w:t>
+        <w:t xml:space="preserve">HelloWorld y rinde homenaje a los seres queridos. Moderna, rápida y fácil</w:t>
+      </w:r>
+      <w:r>
+        <w:t xml:space="preserve"> </w:t>
+      </w:r>
+      <w:r>
+        <w:t xml:space="preserve">de usar.</w:t>
       </w:r>
     </w:p>
     <w:p>
@@ -74,25 +80,13 @@
         <w:pStyle w:val="BodyText"/>
       </w:pPr>
       <w:r>
-        <w:t xml:space="preserve">Desarrollado con Node.js y Discord.js v14, Ciszubot responde tanto al</w:t>
+        <w:t xml:space="preserve">Desarrollada con Python 3.10+, Typer, Rich y Keyboard, Ciszupy ofrece una</w:t>
       </w:r>
       <w:r>
         <w:t xml:space="preserve"> </w:t>
       </w:r>
       <w:r>
-        <w:t xml:space="preserve">prefijo tradicional cz! como a los comandos de barra (slash commands) de</w:t>
-      </w:r>
-      <w:r>
-        <w:t xml:space="preserve"> </w:t>
-      </w:r>
-      <w:r>
-        <w:t xml:space="preserve">Discord, ofreciendo una experiencia completa y accesible para todos los</w:t>
-      </w:r>
-      <w:r>
-        <w:t xml:space="preserve"> </w:t>
-      </w:r>
-      <w:r>
-        <w:t xml:space="preserve">servidores.</w:t>
+        <w:t xml:space="preserve">experiencia interactiva en la terminal con comandos personalizados.</w:t>
       </w:r>
     </w:p>
     <w:p>
@@ -100,7 +94,7 @@
         <w:pStyle w:val="BodyText"/>
       </w:pPr>
       <w:r>
-        <w:t xml:space="preserve">COMANDOS DISPONIBLES (12):</w:t>
+        <w:t xml:space="preserve">COMANDOS DISPONIBLES:</w:t>
       </w:r>
     </w:p>
     <w:p>
@@ -112,7 +106,7 @@
         </w:numPr>
       </w:pPr>
       <w:r>
-        <w:t xml:space="preserve">Información: help, profile, serverinfo</w:t>
+        <w:t xml:space="preserve">Información: help, helloworldmemetest</w:t>
       </w:r>
     </w:p>
     <w:p>
@@ -124,31 +118,7 @@
         </w:numPr>
       </w:pPr>
       <w:r>
-        <w:t xml:space="preserve">Utilidad: ping, pong, test</w:t>
-      </w:r>
-    </w:p>
-    <w:p>
-      <w:pPr>
-        <w:pStyle w:val="Compact"/>
-        <w:numPr>
-          <w:ilvl w:val="0"/>
-          <w:numId w:val="1001"/>
-        </w:numPr>
-      </w:pPr>
-      <w:r>
-        <w:t xml:space="preserve">Diversión: say, directsay, confess, 8ball</w:t>
-      </w:r>
-    </w:p>
-    <w:p>
-      <w:pPr>
-        <w:pStyle w:val="Compact"/>
-        <w:numPr>
-          <w:ilvl w:val="0"/>
-          <w:numId w:val="1001"/>
-        </w:numPr>
-      </w:pPr>
-      <w:r>
-        <w:t xml:space="preserve">Social: hi, bye</w:t>
+        <w:t xml:space="preserve">Homenajes: profesor, papa, mama</w:t>
       </w:r>
     </w:p>
     <w:p>
@@ -168,7 +138,7 @@
         </w:numPr>
       </w:pPr>
       <w:r>
-        <w:t xml:space="preserve">Prefijo: cz! (configurable)</w:t>
+        <w:t xml:space="preserve">CLI con Typer</w:t>
       </w:r>
     </w:p>
     <w:p>
@@ -180,7 +150,7 @@
         </w:numPr>
       </w:pPr>
       <w:r>
-        <w:t xml:space="preserve">Slash commands: Todos los comandos disponibles como /comando</w:t>
+        <w:t xml:space="preserve">Salida enriquecida con Rich</w:t>
       </w:r>
     </w:p>
     <w:p>
@@ -192,7 +162,7 @@
         </w:numPr>
       </w:pPr>
       <w:r>
-        <w:t xml:space="preserve">Embeds con paleta de colores índigo y violeta</w:t>
+        <w:t xml:space="preserve">Hotkeys globales con Keyboard</w:t>
       </w:r>
     </w:p>
     <w:p>
@@ -204,7 +174,7 @@
         </w:numPr>
       </w:pPr>
       <w:r>
-        <w:t xml:space="preserve">Panel de administración Express con estadísticas en vivo</w:t>
+        <w:t xml:space="preserve">Auto-instalación de dependencias</w:t>
       </w:r>
     </w:p>
     <w:p>
@@ -216,7 +186,7 @@
         </w:numPr>
       </w:pPr>
       <w:r>
-        <w:t xml:space="preserve">Logging a consola y archivo</w:t>
+        <w:t xml:space="preserve">Clear screen automático</w:t>
       </w:r>
     </w:p>
     <w:p>
@@ -237,13 +207,13 @@
         <w:t xml:space="preserve"> </w:t>
       </w:r>
       <w:r>
-        <w:t xml:space="preserve">Ciszubot is a Spanish-language Discord bot with 12 commands for information,</w:t>
+        <w:t xml:space="preserve">Ciszupy is a hybrid Python library and CLI that inverts the classic HelloWorld</w:t>
       </w:r>
       <w:r>
         <w:t xml:space="preserve"> </w:t>
       </w:r>
       <w:r>
-        <w:t xml:space="preserve">utility, fun, and social interaction. Modern, fast, and easy to use.</w:t>
+        <w:t xml:space="preserve">and pays tribute to loved ones. Modern, fast, and easy to use.</w:t>
       </w:r>
     </w:p>
     <w:p>
@@ -251,19 +221,13 @@
         <w:pStyle w:val="BodyText"/>
       </w:pPr>
       <w:r>
-        <w:t xml:space="preserve">Developed with Node.js and Discord.js v14, Ciszubot responds to both the</w:t>
+        <w:t xml:space="preserve">Built with Python 3.10+, Typer, Rich, and Keyboard, Ciszupy offers an</w:t>
       </w:r>
       <w:r>
         <w:t xml:space="preserve"> </w:t>
       </w:r>
       <w:r>
-        <w:t xml:space="preserve">traditional cz! prefix and Discord’s slash commands, offering a complete</w:t>
-      </w:r>
-      <w:r>
-        <w:t xml:space="preserve"> </w:t>
-      </w:r>
-      <w:r>
-        <w:t xml:space="preserve">and accessible experience for all servers.</w:t>
+        <w:t xml:space="preserve">interactive terminal experience with custom commands.</w:t>
       </w:r>
     </w:p>
     <w:p>
@@ -271,7 +235,7 @@
         <w:pStyle w:val="BodyText"/>
       </w:pPr>
       <w:r>
-        <w:t xml:space="preserve">AVAILABLE COMMANDS (12):</w:t>
+        <w:t xml:space="preserve">AVAILABLE COMMANDS:</w:t>
       </w:r>
     </w:p>
     <w:p>
@@ -283,7 +247,7 @@
         </w:numPr>
       </w:pPr>
       <w:r>
-        <w:t xml:space="preserve">Information: help, profile, serverinfo</w:t>
+        <w:t xml:space="preserve">Information: help, helloworldmemetest</w:t>
       </w:r>
     </w:p>
     <w:p>
@@ -295,31 +259,7 @@
         </w:numPr>
       </w:pPr>
       <w:r>
-        <w:t xml:space="preserve">Utility: ping, pong, test</w:t>
-      </w:r>
-    </w:p>
-    <w:p>
-      <w:pPr>
-        <w:pStyle w:val="Compact"/>
-        <w:numPr>
-          <w:ilvl w:val="0"/>
-          <w:numId w:val="1003"/>
-        </w:numPr>
-      </w:pPr>
-      <w:r>
-        <w:t xml:space="preserve">Fun: say, directsay, confess, 8ball</w:t>
-      </w:r>
-    </w:p>
-    <w:p>
-      <w:pPr>
-        <w:pStyle w:val="Compact"/>
-        <w:numPr>
-          <w:ilvl w:val="0"/>
-          <w:numId w:val="1003"/>
-        </w:numPr>
-      </w:pPr>
-      <w:r>
-        <w:t xml:space="preserve">Social: hi, bye</w:t>
+        <w:t xml:space="preserve">Tributes: profesor, papa, mama</w:t>
       </w:r>
     </w:p>
     <w:p>
@@ -339,7 +279,7 @@
         </w:numPr>
       </w:pPr>
       <w:r>
-        <w:t xml:space="preserve">Prefix: cz! (configurable)</w:t>
+        <w:t xml:space="preserve">Typer-based CLI</w:t>
       </w:r>
     </w:p>
     <w:p>
@@ -351,7 +291,7 @@
         </w:numPr>
       </w:pPr>
       <w:r>
-        <w:t xml:space="preserve">Slash commands: All commands available as /command</w:t>
+        <w:t xml:space="preserve">Rich terminal output</w:t>
       </w:r>
     </w:p>
     <w:p>
@@ -363,7 +303,7 @@
         </w:numPr>
       </w:pPr>
       <w:r>
-        <w:t xml:space="preserve">Embeds with indigo and violet color palette</w:t>
+        <w:t xml:space="preserve">Global hotkeys with Keyboard</w:t>
       </w:r>
     </w:p>
     <w:p>
@@ -375,7 +315,7 @@
         </w:numPr>
       </w:pPr>
       <w:r>
-        <w:t xml:space="preserve">Express admin panel with live statistics</w:t>
+        <w:t xml:space="preserve">Auto-install dependencies</w:t>
       </w:r>
     </w:p>
     <w:p>
@@ -387,7 +327,7 @@
         </w:numPr>
       </w:pPr>
       <w:r>
-        <w:t xml:space="preserve">Console and file logging</w:t>
+        <w:t xml:space="preserve">Auto clear screen</w:t>
       </w:r>
     </w:p>
     <w:sectPr>

</xml_diff>